<commit_message>
Update CV (June 2026): CBA talk + travel scholarship; sync served PDF
Simon merged the updated docx over the original and exported the new PDF.
Copies the new PDF to public/cv/ (the file the site serves) and bumps
cv.lastUpdated to 2026-06.

Co-Authored-By: Claude Fable 5 <noreply@anthropic.com>
</commit_message>
<xml_diff>
--- a/docs/Zhaoxiang Cai CV - research.docx
+++ b/docs/Zhaoxiang Cai CV - research.docx
@@ -29,25 +29,35 @@
           <w:sz w:val="20"/>
           <w:szCs w:val="20"/>
         </w:rPr>
-        <w:t xml:space="preserve">PhD (Cancer Data Science), </w:t>
-      </w:r>
-      <w:proofErr w:type="spellStart"/>
+        <w:t>PhD (Cancer Data Science), MBusA (First Class Hons), BCompSc (First Class Hons)</w:t>
+      </w:r>
+    </w:p>
+    <w:p>
+      <w:pPr>
+        <w:spacing w:after="40"/>
+        <w:jc w:val="center"/>
+      </w:pPr>
       <w:r>
         <w:rPr>
           <w:color w:val="404040"/>
           <w:sz w:val="20"/>
           <w:szCs w:val="20"/>
         </w:rPr>
-        <w:t>MBusA</w:t>
-      </w:r>
-      <w:proofErr w:type="spellEnd"/>
+        <w:t>Conjoint Associate Lecturer, University of Sydney</w:t>
+      </w:r>
+    </w:p>
+    <w:p>
+      <w:pPr>
+        <w:spacing w:after="40"/>
+        <w:jc w:val="center"/>
+      </w:pPr>
       <w:r>
         <w:rPr>
           <w:color w:val="404040"/>
           <w:sz w:val="20"/>
           <w:szCs w:val="20"/>
         </w:rPr>
-        <w:t xml:space="preserve"> (First Class Hons), BCompSc (First Class Hons)</w:t>
+        <w:t>Senior Data Scientist (Cancer Data Science), Children’s Medical Research Institute</w:t>
       </w:r>
     </w:p>
     <w:p>
@@ -57,45 +67,10 @@
       </w:pPr>
       <w:r>
         <w:rPr>
-          <w:color w:val="404040"/>
-          <w:sz w:val="20"/>
-          <w:szCs w:val="20"/>
-        </w:rPr>
-        <w:t>Conjoint Associate Lecturer, University of Sydney</w:t>
-      </w:r>
-    </w:p>
-    <w:p>
-      <w:pPr>
-        <w:spacing w:after="40"/>
-        <w:jc w:val="center"/>
-      </w:pPr>
-      <w:r>
-        <w:rPr>
-          <w:color w:val="404040"/>
-          <w:sz w:val="20"/>
-          <w:szCs w:val="20"/>
-        </w:rPr>
-        <w:t>Senior Data Scientist (Cancer Data Science), Children’s Medical Research Institute</w:t>
-      </w:r>
-    </w:p>
-    <w:p>
-      <w:pPr>
-        <w:spacing w:after="40"/>
-        <w:jc w:val="center"/>
-      </w:pPr>
-      <w:r>
-        <w:rPr>
           <w:sz w:val="19"/>
           <w:szCs w:val="19"/>
         </w:rPr>
-        <w:t xml:space="preserve">+61 421 992 704  |  </w:t>
-      </w:r>
-      <w:r>
-        <w:rPr>
-          <w:sz w:val="19"/>
-          <w:szCs w:val="19"/>
-        </w:rPr>
-        <w:t>zhaoxiang.cai@hotmail.com</w:t>
+        <w:t>+61 421 992 704  |  zhaoxiang.cai@hotmail.com</w:t>
       </w:r>
     </w:p>
     <w:p>
@@ -173,25 +148,7 @@
           <w:sz w:val="19"/>
           <w:szCs w:val="19"/>
         </w:rPr>
-        <w:t>Citation metrics obtained from Google Scholar. Field-Weighted Citation Impact (FWCI) from Scopus/</w:t>
-      </w:r>
-      <w:proofErr w:type="spellStart"/>
-      <w:r>
-        <w:rPr>
-          <w:color w:val="555555"/>
-          <w:sz w:val="19"/>
-          <w:szCs w:val="19"/>
-        </w:rPr>
-        <w:t>SciVal</w:t>
-      </w:r>
-      <w:proofErr w:type="spellEnd"/>
-      <w:r>
-        <w:rPr>
-          <w:color w:val="555555"/>
-          <w:sz w:val="19"/>
-          <w:szCs w:val="19"/>
-        </w:rPr>
-        <w:t>.</w:t>
+        <w:t>Citation metrics obtained from Google Scholar. Field-Weighted Citation Impact (FWCI) from Scopus/SciVal.</w:t>
       </w:r>
     </w:p>
     <w:tbl>
@@ -396,17 +353,7 @@
                 <w:sz w:val="32"/>
                 <w:szCs w:val="32"/>
               </w:rPr>
-              <w:t xml:space="preserve">5 of </w:t>
-            </w:r>
-            <w:r>
-              <w:rPr>
-                <w:b/>
-                <w:bCs/>
-                <w:color w:val="FFFFFF"/>
-                <w:sz w:val="32"/>
-                <w:szCs w:val="32"/>
-              </w:rPr>
-              <w:t>10</w:t>
+              <w:t>5 of 10</w:t>
             </w:r>
           </w:p>
           <w:p>
@@ -660,14 +607,7 @@
           <w:b/>
           <w:bCs/>
         </w:rPr>
-        <w:t>Adjunct</w:t>
-      </w:r>
-      <w:r>
-        <w:rPr>
-          <w:b/>
-          <w:bCs/>
-        </w:rPr>
-        <w:t xml:space="preserve"> Lecturer</w:t>
+        <w:t>Adjunct Lecturer</w:t>
       </w:r>
       <w:r>
         <w:t>, Faculty of Medicine and Health, University of Sydney</w:t>
@@ -678,34 +618,68 @@
         <w:rPr>
           <w:color w:val="555555"/>
         </w:rPr>
-        <w:t>June 202</w:t>
-      </w:r>
+        <w:t>June 2026 – present</w:t>
+      </w:r>
+    </w:p>
+    <w:p>
+      <w:pPr>
+        <w:spacing w:before="120" w:after="20"/>
+      </w:pPr>
+      <w:r>
+        <w:rPr>
+          <w:b/>
+          <w:bCs/>
+        </w:rPr>
+        <w:t>Conjoint Associate Lecturer</w:t>
+      </w:r>
+      <w:r>
+        <w:t>, Faculty of Medicine and Health, University of Sydney</w:t>
+      </w:r>
+    </w:p>
+    <w:p>
       <w:r>
         <w:rPr>
           <w:color w:val="555555"/>
         </w:rPr>
-        <w:t>6</w:t>
-      </w:r>
+        <w:t>June 2023 – 2026</w:t>
+      </w:r>
+    </w:p>
+    <w:p>
+      <w:pPr>
+        <w:spacing w:before="80" w:after="20"/>
+      </w:pPr>
+      <w:r>
+        <w:rPr>
+          <w:b/>
+          <w:bCs/>
+        </w:rPr>
+        <w:t>PhD Candidate (Cancer Data Science)</w:t>
+      </w:r>
+      <w:r>
+        <w:t>, Children’s Medical Research Institute / University of Sydney</w:t>
+      </w:r>
+    </w:p>
+    <w:p>
       <w:r>
         <w:rPr>
           <w:color w:val="555555"/>
         </w:rPr>
-        <w:t xml:space="preserve"> – present</w:t>
-      </w:r>
-    </w:p>
-    <w:p>
-      <w:pPr>
-        <w:spacing w:before="120" w:after="20"/>
-      </w:pPr>
-      <w:r>
-        <w:rPr>
-          <w:b/>
-          <w:bCs/>
-        </w:rPr>
-        <w:t>Conjoint Associate Lecturer</w:t>
-      </w:r>
-      <w:r>
-        <w:t>, Faculty of Medicine and Health, University of Sydney</w:t>
+        <w:t>March 2020 – February 2023</w:t>
+      </w:r>
+    </w:p>
+    <w:p>
+      <w:pPr>
+        <w:spacing w:before="80" w:after="20"/>
+      </w:pPr>
+      <w:r>
+        <w:rPr>
+          <w:b/>
+          <w:bCs/>
+        </w:rPr>
+        <w:t>Data Scientist / Bioinformatician</w:t>
+      </w:r>
+      <w:r>
+        <w:t>, Children’s Medical Research Institute, Westmead</w:t>
       </w:r>
     </w:p>
     <w:p>
@@ -713,98 +687,38 @@
         <w:rPr>
           <w:color w:val="555555"/>
         </w:rPr>
-        <w:t xml:space="preserve">June 2023 – </w:t>
-      </w:r>
+        <w:t>January 2019 – March 2020</w:t>
+      </w:r>
+    </w:p>
+    <w:p>
+      <w:pPr>
+        <w:spacing w:before="80" w:after="20"/>
+      </w:pPr>
+      <w:r>
+        <w:rPr>
+          <w:b/>
+          <w:bCs/>
+        </w:rPr>
+        <w:t>Analyst Programmer</w:t>
+      </w:r>
+      <w:r>
+        <w:t>, Goldman Sachs, Melbourne</w:t>
+      </w:r>
+    </w:p>
+    <w:p>
+      <w:pPr>
+        <w:spacing w:after="20"/>
+      </w:pPr>
       <w:r>
         <w:rPr>
           <w:color w:val="555555"/>
         </w:rPr>
-        <w:t>2026</w:t>
-      </w:r>
-    </w:p>
-    <w:p>
-      <w:pPr>
-        <w:spacing w:before="80" w:after="20"/>
-      </w:pPr>
-      <w:r>
-        <w:rPr>
-          <w:b/>
-          <w:bCs/>
-        </w:rPr>
-        <w:t>PhD Candidate (Cancer Data Science)</w:t>
-      </w:r>
-      <w:r>
-        <w:t>, Children’s Medical Research Institute / University of Sydney</w:t>
-      </w:r>
-    </w:p>
-    <w:p>
-      <w:r>
-        <w:rPr>
-          <w:color w:val="555555"/>
-        </w:rPr>
-        <w:t>March 2020 – February 2023</w:t>
-      </w:r>
-    </w:p>
-    <w:p>
-      <w:pPr>
-        <w:spacing w:before="80" w:after="20"/>
-      </w:pPr>
-      <w:r>
-        <w:rPr>
-          <w:b/>
-          <w:bCs/>
-        </w:rPr>
-        <w:t>Data Scientist / Bioinformatician</w:t>
-      </w:r>
-      <w:r>
-        <w:t>, Children’s Medical Research Institute, Westmead</w:t>
-      </w:r>
-    </w:p>
-    <w:p>
-      <w:r>
-        <w:rPr>
-          <w:color w:val="555555"/>
-        </w:rPr>
-        <w:t>January 2019 – March 2020</w:t>
-      </w:r>
-    </w:p>
-    <w:p>
-      <w:pPr>
-        <w:spacing w:before="80" w:after="20"/>
-      </w:pPr>
-      <w:r>
-        <w:rPr>
-          <w:b/>
-          <w:bCs/>
-        </w:rPr>
-        <w:t>Analyst Programmer</w:t>
-      </w:r>
-      <w:r>
-        <w:t>, Goldman Sachs, Melbourne</w:t>
-      </w:r>
-    </w:p>
-    <w:p>
-      <w:pPr>
-        <w:spacing w:after="20"/>
-      </w:pPr>
-      <w:r>
-        <w:rPr>
-          <w:color w:val="555555"/>
-        </w:rPr>
         <w:t>November 2014 – January 2018</w:t>
       </w:r>
     </w:p>
     <w:p>
       <w:r>
-        <w:t xml:space="preserve">Electronic Trading (GSET) division. Delivered Shenzhen-Hong Kong Stock Connect project (Federation Award 2016). Established India GSET clearing </w:t>
-      </w:r>
-      <w:proofErr w:type="gramStart"/>
-      <w:r>
-        <w:t>clients</w:t>
-      </w:r>
-      <w:proofErr w:type="gramEnd"/>
-      <w:r>
-        <w:t xml:space="preserve"> business flow.</w:t>
+        <w:t>Electronic Trading (GSET) division. Delivered Shenzhen-Hong Kong Stock Connect project (Federation Award 2016). Established India GSET clearing clients business flow.</w:t>
       </w:r>
     </w:p>
     <w:p>
@@ -935,23 +849,7 @@
           <w:b/>
           <w:bCs/>
         </w:rPr>
-        <w:t xml:space="preserve">Total competitive research funding contributed </w:t>
-      </w:r>
-      <w:proofErr w:type="gramStart"/>
-      <w:r>
-        <w:rPr>
-          <w:b/>
-          <w:bCs/>
-        </w:rPr>
-        <w:t>to:</w:t>
-      </w:r>
-      <w:proofErr w:type="gramEnd"/>
-      <w:r>
-        <w:rPr>
-          <w:b/>
-          <w:bCs/>
-        </w:rPr>
-        <w:t xml:space="preserve"> </w:t>
+        <w:t xml:space="preserve">Total competitive research funding contributed to: </w:t>
       </w:r>
       <w:r>
         <w:t>over $1.59 million</w:t>
@@ -978,6 +876,14 @@
         <w:spacing w:before="80" w:after="40"/>
       </w:pPr>
       <w:r>
+        <w:t>Cancer Bioinformatics Australia Symposium Travel Scholarship (2026)</w:t>
+      </w:r>
+    </w:p>
+    <w:p>
+      <w:pPr>
+        <w:spacing w:after="40"/>
+      </w:pPr>
+      <w:r>
         <w:t>Sydney Cancer Partners PhD Scholarship (2022)</w:t>
       </w:r>
     </w:p>
@@ -1069,15 +975,7 @@
         <w:t>bold underline</w:t>
       </w:r>
       <w:r>
-        <w:t>. * denotes equal contribution. FWCI = Field-Weighted Citation Impact (Scopus/</w:t>
-      </w:r>
-      <w:proofErr w:type="spellStart"/>
-      <w:r>
-        <w:t>SciVal</w:t>
-      </w:r>
-      <w:proofErr w:type="spellEnd"/>
-      <w:r>
-        <w:t>); FWCI &gt; 1.0 indicates above world average.</w:t>
+        <w:t>. * denotes equal contribution. FWCI = Field-Weighted Citation Impact (Scopus/SciVal); FWCI &gt; 1.0 indicates above world average.</w:t>
       </w:r>
     </w:p>
     <w:p>
@@ -1101,15 +999,7 @@
         <w:t>Cai, Z.</w:t>
       </w:r>
       <w:r>
-        <w:t xml:space="preserve">, Boys, E. L., Noor, Z., Aref, A. T., Xavier, D., Lucas, N., Williams, S. G., Koh, J. M., Poulos, R. C., Wu, Y., </w:t>
-      </w:r>
-      <w:proofErr w:type="spellStart"/>
-      <w:r>
-        <w:t>Dausmann</w:t>
-      </w:r>
-      <w:proofErr w:type="spellEnd"/>
-      <w:r>
-        <w:t xml:space="preserve">, M., MacKenzie, K. L., Aguilar-Mahecha, A., Armengol, C., Barranco, M. M., Basik, M., Bowman, E. D., Clifton-Bligh, R., Connolly, E. A., ... Reddel, R. R. (2025). </w:t>
+        <w:t xml:space="preserve">, Boys, E. L., Noor, Z., Aref, A. T., Xavier, D., Lucas, N., Williams, S. G., Koh, J. M., Poulos, R. C., Wu, Y., Dausmann, M., MacKenzie, K. L., Aguilar-Mahecha, A., Armengol, C., Barranco, M. M., Basik, M., Bowman, E. D., Clifton-Bligh, R., Connolly, E. A., ... Reddel, R. R. (2025). </w:t>
       </w:r>
       <w:r>
         <w:rPr>
@@ -1150,8 +1040,66 @@
           <w:sz w:val="19"/>
           <w:szCs w:val="19"/>
         </w:rPr>
-        <w:t xml:space="preserve">First author. IF </w:t>
-      </w:r>
+        <w:t>First author. IF 33.3. First application of federated deep learning to cancer proteomics, enabling model training across 7,500 cancer proteomes from multiple centres without sharing raw data.</w:t>
+      </w:r>
+    </w:p>
+    <w:p>
+      <w:pPr>
+        <w:spacing w:before="120" w:after="40"/>
+        <w:ind w:left="360" w:hanging="360"/>
+      </w:pPr>
+      <w:r>
+        <w:rPr>
+          <w:b/>
+          <w:bCs/>
+        </w:rPr>
+        <w:t xml:space="preserve">2. </w:t>
+      </w:r>
+      <w:r>
+        <w:t xml:space="preserve">Wu, Y., </w:t>
+      </w:r>
+      <w:r>
+        <w:rPr>
+          <w:b/>
+          <w:bCs/>
+          <w:u w:val="single"/>
+        </w:rPr>
+        <w:t>Cai, Z.</w:t>
+      </w:r>
+      <w:r>
+        <w:t xml:space="preserve">, Cross, D., Noble, J. R., Prest, K., Littleboy, J., Cohen, S. B., Edlundh, B., Koh, J. M. S., Xu, R., Noor, Z., Bastami, M., Valentini, S., Richardson, L., Barthorpe, S., Arymanesh, N., Robinson, P. J., Hains, P. G., Garnett, M. J., ... MacKenzie, K. L. (2025). </w:t>
+      </w:r>
+      <w:r>
+        <w:rPr>
+          <w:i/>
+          <w:iCs/>
+        </w:rPr>
+        <w:t>Large-scale drug sensitivity, gene dependency, and proteogenomic analyses of telomere maintenance mechanisms in cancer cells. Nature Communications</w:t>
+      </w:r>
+      <w:r>
+        <w:t>, 16(1), 11337.</w:t>
+      </w:r>
+      <w:r>
+        <w:rPr>
+          <w:b/>
+          <w:bCs/>
+        </w:rPr>
+        <w:t xml:space="preserve"> FWCI: N/A.</w:t>
+      </w:r>
+      <w:r>
+        <w:rPr>
+          <w:color w:val="555555"/>
+          <w:sz w:val="19"/>
+          <w:szCs w:val="19"/>
+        </w:rPr>
+        <w:t xml:space="preserve"> [1 citation]</w:t>
+      </w:r>
+    </w:p>
+    <w:p>
+      <w:pPr>
+        <w:spacing w:after="80"/>
+        <w:ind w:left="540"/>
+      </w:pPr>
       <w:r>
         <w:rPr>
           <w:i/>
@@ -1160,8 +1108,66 @@
           <w:sz w:val="19"/>
           <w:szCs w:val="19"/>
         </w:rPr>
-        <w:t>33.3</w:t>
-      </w:r>
+        <w:t>Co-author. IF 15.7. Contributed computational analyses for proteogenomic characterisation of telomere maintenance mechanisms.</w:t>
+      </w:r>
+    </w:p>
+    <w:p>
+      <w:pPr>
+        <w:spacing w:before="120" w:after="40"/>
+        <w:ind w:left="360" w:hanging="360"/>
+      </w:pPr>
+      <w:r>
+        <w:rPr>
+          <w:b/>
+          <w:bCs/>
+        </w:rPr>
+        <w:t xml:space="preserve">3. </w:t>
+      </w:r>
+      <w:r>
+        <w:t xml:space="preserve">Baião, A. R., </w:t>
+      </w:r>
+      <w:r>
+        <w:rPr>
+          <w:b/>
+          <w:bCs/>
+          <w:u w:val="single"/>
+        </w:rPr>
+        <w:t>Cai, Z.</w:t>
+      </w:r>
+      <w:r>
+        <w:t xml:space="preserve">, Poulos, R. C., Robinson, P. J., Reddel, R. R., Zhong, Q., ... &amp; Gonçalves, E. (2025). </w:t>
+      </w:r>
+      <w:r>
+        <w:rPr>
+          <w:i/>
+          <w:iCs/>
+        </w:rPr>
+        <w:t>A technical review of multi-omics data integration methods: from classical statistical to deep generative approaches. Briefings in Bioinformatics</w:t>
+      </w:r>
+      <w:r>
+        <w:t>, 26(4), bbaf355.</w:t>
+      </w:r>
+      <w:r>
+        <w:rPr>
+          <w:b/>
+          <w:bCs/>
+        </w:rPr>
+        <w:t xml:space="preserve"> FWCI: 6.98.</w:t>
+      </w:r>
+      <w:r>
+        <w:rPr>
+          <w:color w:val="555555"/>
+          <w:sz w:val="19"/>
+          <w:szCs w:val="19"/>
+        </w:rPr>
+        <w:t xml:space="preserve"> [77 citations]</w:t>
+      </w:r>
+    </w:p>
+    <w:p>
+      <w:pPr>
+        <w:spacing w:after="80"/>
+        <w:ind w:left="540"/>
+      </w:pPr>
       <w:r>
         <w:rPr>
           <w:i/>
@@ -1170,7 +1176,7 @@
           <w:sz w:val="19"/>
           <w:szCs w:val="19"/>
         </w:rPr>
-        <w:t>. First application of federated deep learning to cancer proteomics, enabling model training across 7,500 cancer proteomes from multiple centres without sharing raw data.</w:t>
+        <w:t>Co-author. International collaboration with University of Lisbon.</w:t>
       </w:r>
     </w:p>
     <w:p>
@@ -1183,10 +1189,10 @@
           <w:b/>
           <w:bCs/>
         </w:rPr>
-        <w:t xml:space="preserve">2. </w:t>
-      </w:r>
-      <w:r>
-        <w:t xml:space="preserve">Wu, Y., </w:t>
+        <w:t xml:space="preserve">4. </w:t>
+      </w:r>
+      <w:r>
+        <w:t xml:space="preserve">Osteil, P., Withey, S., Santucci, N., Aryamanesh, N., Pang, I., Salehin, N., ... </w:t>
       </w:r>
       <w:r>
         <w:rPr>
@@ -1197,40 +1203,24 @@
         <w:t>Cai, Z.</w:t>
       </w:r>
       <w:r>
-        <w:t xml:space="preserve">, Cross, D., Noble, J. R., Prest, K., Littleboy, J., Cohen, S. B., </w:t>
-      </w:r>
-      <w:proofErr w:type="spellStart"/>
-      <w:r>
-        <w:t>Edlundh</w:t>
-      </w:r>
-      <w:proofErr w:type="spellEnd"/>
-      <w:r>
-        <w:t xml:space="preserve">, B., Koh, J. M. S., Xu, R., Noor, Z., Bastami, M., Valentini, S., Richardson, L., Barthorpe, S., </w:t>
-      </w:r>
-      <w:proofErr w:type="spellStart"/>
-      <w:r>
-        <w:t>Arymanesh</w:t>
-      </w:r>
-      <w:proofErr w:type="spellEnd"/>
-      <w:r>
-        <w:t xml:space="preserve">, N., Robinson, P. J., Hains, P. G., Garnett, M. J., ... MacKenzie, K. L. (2025). </w:t>
+        <w:t xml:space="preserve">, Wolvetang, E. &amp; Tam, P. P. (2025). </w:t>
       </w:r>
       <w:r>
         <w:rPr>
           <w:i/>
           <w:iCs/>
         </w:rPr>
-        <w:t>Large-scale drug sensitivity, gene dependency, and proteogenomic analyses of telomere maintenance mechanisms in cancer cells. Nature Communications</w:t>
-      </w:r>
-      <w:r>
-        <w:t>, 16(1), 11337.</w:t>
-      </w:r>
-      <w:r>
-        <w:rPr>
-          <w:b/>
-          <w:bCs/>
-        </w:rPr>
-        <w:t xml:space="preserve"> FWCI: N/A.</w:t>
+        <w:t>MIXL1 activation in endoderm differentiation of human induced pluripotent stem cells. Stem Cell Reports</w:t>
+      </w:r>
+      <w:r>
+        <w:t>.</w:t>
+      </w:r>
+      <w:r>
+        <w:rPr>
+          <w:b/>
+          <w:bCs/>
+        </w:rPr>
+        <w:t xml:space="preserve"> FWCI: 0.76.</w:t>
       </w:r>
       <w:r>
         <w:rPr>
@@ -1254,8 +1244,64 @@
           <w:sz w:val="19"/>
           <w:szCs w:val="19"/>
         </w:rPr>
-        <w:t>Co-author. IF 1</w:t>
-      </w:r>
+        <w:t>Co-author.</w:t>
+      </w:r>
+    </w:p>
+    <w:p>
+      <w:pPr>
+        <w:spacing w:before="120" w:after="40"/>
+        <w:ind w:left="360" w:hanging="360"/>
+      </w:pPr>
+      <w:r>
+        <w:rPr>
+          <w:b/>
+          <w:bCs/>
+        </w:rPr>
+        <w:lastRenderedPageBreak/>
+        <w:t xml:space="preserve">5. </w:t>
+      </w:r>
+      <w:r>
+        <w:rPr>
+          <w:b/>
+          <w:bCs/>
+          <w:u w:val="single"/>
+        </w:rPr>
+        <w:t>Cai, Z.</w:t>
+      </w:r>
+      <w:r>
+        <w:t xml:space="preserve">, Apolinário, S., Baião, A. R., Pacini, C., Sousa, M. D., Vinga, S., ... &amp; Gonçalves, E. (2024). </w:t>
+      </w:r>
+      <w:r>
+        <w:rPr>
+          <w:i/>
+          <w:iCs/>
+        </w:rPr>
+        <w:t>Synthetic augmentation of cancer cell line multi-omic datasets using unsupervised deep learning. Nature Communications</w:t>
+      </w:r>
+      <w:r>
+        <w:t>, 15(1), 1–12.</w:t>
+      </w:r>
+      <w:r>
+        <w:rPr>
+          <w:b/>
+          <w:bCs/>
+        </w:rPr>
+        <w:t xml:space="preserve"> FWCI: 2.94.</w:t>
+      </w:r>
+      <w:r>
+        <w:rPr>
+          <w:color w:val="555555"/>
+          <w:sz w:val="19"/>
+          <w:szCs w:val="19"/>
+        </w:rPr>
+        <w:t xml:space="preserve"> [32 citations]</w:t>
+      </w:r>
+    </w:p>
+    <w:p>
+      <w:pPr>
+        <w:spacing w:after="80"/>
+        <w:ind w:left="540"/>
+      </w:pPr>
       <w:r>
         <w:rPr>
           <w:i/>
@@ -1264,8 +1310,63 @@
           <w:sz w:val="19"/>
           <w:szCs w:val="19"/>
         </w:rPr>
-        <w:t>5</w:t>
-      </w:r>
+        <w:t>First author. IF 15.7. Introduces MOSA (Multi-Omics Synthetic Augmentation), a generative AI approach using multi-view variational autoencoders. International collaboration with University of Lisbon.</w:t>
+      </w:r>
+    </w:p>
+    <w:p>
+      <w:pPr>
+        <w:spacing w:before="120" w:after="40"/>
+        <w:ind w:left="360" w:hanging="360"/>
+      </w:pPr>
+      <w:r>
+        <w:rPr>
+          <w:b/>
+          <w:bCs/>
+        </w:rPr>
+        <w:t xml:space="preserve">6. </w:t>
+      </w:r>
+      <w:r>
+        <w:rPr>
+          <w:b/>
+          <w:bCs/>
+          <w:u w:val="single"/>
+        </w:rPr>
+        <w:t>Cai, Z.</w:t>
+      </w:r>
+      <w:r>
+        <w:t xml:space="preserve">, Poulos, R. C., Aref, A., Robinson, P. J., Reddel, R. R., &amp; Zhong, Q. (2024). </w:t>
+      </w:r>
+      <w:r>
+        <w:rPr>
+          <w:i/>
+          <w:iCs/>
+        </w:rPr>
+        <w:t>DeePathNet: a transformer-based deep learning model integrating multi-omic data with cancer pathways. Cancer Research Communications</w:t>
+      </w:r>
+      <w:r>
+        <w:t>, 4(12), 3151–3164.</w:t>
+      </w:r>
+      <w:r>
+        <w:rPr>
+          <w:b/>
+          <w:bCs/>
+        </w:rPr>
+        <w:t xml:space="preserve"> FWCI: 3.75.</w:t>
+      </w:r>
+      <w:r>
+        <w:rPr>
+          <w:color w:val="555555"/>
+          <w:sz w:val="19"/>
+          <w:szCs w:val="19"/>
+        </w:rPr>
+        <w:t xml:space="preserve"> [33 citations]</w:t>
+      </w:r>
+    </w:p>
+    <w:p>
+      <w:pPr>
+        <w:spacing w:after="80"/>
+        <w:ind w:left="540"/>
+      </w:pPr>
       <w:r>
         <w:rPr>
           <w:i/>
@@ -1274,7 +1375,7 @@
           <w:sz w:val="19"/>
           <w:szCs w:val="19"/>
         </w:rPr>
-        <w:t>.7. Contributed computational analyses for proteogenomic characterisation of telomere maintenance mechanisms.</w:t>
+        <w:t>First author. Novel transformer-based architecture integrating multi-omic data with cancer pathway knowledge for improved interpretability and prediction accuracy.</w:t>
       </w:r>
     </w:p>
     <w:p>
@@ -1287,10 +1388,10 @@
           <w:b/>
           <w:bCs/>
         </w:rPr>
-        <w:t xml:space="preserve">3. </w:t>
-      </w:r>
-      <w:r>
-        <w:t xml:space="preserve">Baião, A. R., </w:t>
+        <w:t xml:space="preserve">7. </w:t>
+      </w:r>
+      <w:r>
+        <w:t xml:space="preserve">Gonçalves, E.*, Poulos, R. C.*, </w:t>
       </w:r>
       <w:r>
         <w:rPr>
@@ -1298,27 +1399,27 @@
           <w:bCs/>
           <w:u w:val="single"/>
         </w:rPr>
-        <w:t>Cai, Z.</w:t>
-      </w:r>
-      <w:r>
-        <w:t xml:space="preserve">, Poulos, R. C., Robinson, P. J., Reddel, R. R., Zhong, Q., ... &amp; Gonçalves, E. (2025). </w:t>
+        <w:t>Cai, Z.*</w:t>
+      </w:r>
+      <w:r>
+        <w:t xml:space="preserve">, ..., Robinson, P., Zhong, Q., Garnett, M., Reddel, R. R. (* equal contribution) (2022). </w:t>
       </w:r>
       <w:r>
         <w:rPr>
           <w:i/>
           <w:iCs/>
         </w:rPr>
-        <w:t>A technical review of multi-omics data integration methods: from classical statistical to deep generative approaches. Briefings in Bioinformatics</w:t>
-      </w:r>
-      <w:r>
-        <w:t>, 26(4), bbaf355.</w:t>
-      </w:r>
-      <w:r>
-        <w:rPr>
-          <w:b/>
-          <w:bCs/>
-        </w:rPr>
-        <w:t xml:space="preserve"> FWCI: 6.98.</w:t>
+        <w:t>Pan-cancer proteomic map of 949 human cell lines. Cancer Cell</w:t>
+      </w:r>
+      <w:r>
+        <w:t>, 40(8), 835–849.</w:t>
+      </w:r>
+      <w:r>
+        <w:rPr>
+          <w:b/>
+          <w:bCs/>
+        </w:rPr>
+        <w:t xml:space="preserve"> FWCI: 10.50.</w:t>
       </w:r>
       <w:r>
         <w:rPr>
@@ -1326,7 +1427,7 @@
           <w:sz w:val="19"/>
           <w:szCs w:val="19"/>
         </w:rPr>
-        <w:t xml:space="preserve"> [77 citations]</w:t>
+        <w:t xml:space="preserve"> [230 citations]</w:t>
       </w:r>
     </w:p>
     <w:p>
@@ -1342,7 +1443,7 @@
           <w:sz w:val="19"/>
           <w:szCs w:val="19"/>
         </w:rPr>
-        <w:t>Co-author. International collaboration with University of Lisbon.</w:t>
+        <w:t>Co-first author. IF 44.5. The world’s largest pan-cancer proteomic resource at time of publication. Collaboration with Wellcome Sanger Institute (Cambridge, UK). Featured on ABC Radio and institutional media.</w:t>
       </w:r>
     </w:p>
     <w:p>
@@ -1355,23 +1456,7 @@
           <w:b/>
           <w:bCs/>
         </w:rPr>
-        <w:t xml:space="preserve">4. </w:t>
-      </w:r>
-      <w:proofErr w:type="spellStart"/>
-      <w:r>
-        <w:t>Osteil</w:t>
-      </w:r>
-      <w:proofErr w:type="spellEnd"/>
-      <w:r>
-        <w:t xml:space="preserve">, P., Withey, S., Santucci, N., Aryamanesh, N., Pang, I., </w:t>
-      </w:r>
-      <w:proofErr w:type="spellStart"/>
-      <w:r>
-        <w:t>Salehin</w:t>
-      </w:r>
-      <w:proofErr w:type="spellEnd"/>
-      <w:r>
-        <w:t xml:space="preserve">, N., ... </w:t>
+        <w:t xml:space="preserve">8. </w:t>
       </w:r>
       <w:r>
         <w:rPr>
@@ -1382,32 +1467,24 @@
         <w:t>Cai, Z.</w:t>
       </w:r>
       <w:r>
-        <w:t xml:space="preserve">, </w:t>
-      </w:r>
-      <w:proofErr w:type="spellStart"/>
-      <w:r>
-        <w:t>Wolvetang</w:t>
-      </w:r>
-      <w:proofErr w:type="spellEnd"/>
-      <w:r>
-        <w:t xml:space="preserve">, E. &amp; Tam, P. P. (2025). </w:t>
+        <w:t xml:space="preserve">, Poulos, R. C., Liu, J., &amp; Zhong, Q. (2022). </w:t>
       </w:r>
       <w:r>
         <w:rPr>
           <w:i/>
           <w:iCs/>
         </w:rPr>
-        <w:t>MIXL1 activation in endoderm differentiation of human induced pluripotent stem cells. Stem Cell Reports</w:t>
-      </w:r>
-      <w:r>
-        <w:t>.</w:t>
-      </w:r>
-      <w:r>
-        <w:rPr>
-          <w:b/>
-          <w:bCs/>
-        </w:rPr>
-        <w:t xml:space="preserve"> FWCI: 0.76.</w:t>
+        <w:t>Machine learning for multi-omics data integration in cancer. iScience</w:t>
+      </w:r>
+      <w:r>
+        <w:t>, 103798.</w:t>
+      </w:r>
+      <w:r>
+        <w:rPr>
+          <w:b/>
+          <w:bCs/>
+        </w:rPr>
+        <w:t xml:space="preserve"> FWCI: 5.73.</w:t>
       </w:r>
       <w:r>
         <w:rPr>
@@ -1415,7 +1492,7 @@
           <w:sz w:val="19"/>
           <w:szCs w:val="19"/>
         </w:rPr>
-        <w:t xml:space="preserve"> [1 citation]</w:t>
+        <w:t xml:space="preserve"> [288 citations]</w:t>
       </w:r>
     </w:p>
     <w:p>
@@ -1431,7 +1508,7 @@
           <w:sz w:val="19"/>
           <w:szCs w:val="19"/>
         </w:rPr>
-        <w:t>Co-author.</w:t>
+        <w:t>First author. IF 4.1. Widely cited review for researchers entering the field of computational multi-omics integration.</w:t>
       </w:r>
     </w:p>
     <w:p>
@@ -1444,7 +1521,10 @@
           <w:b/>
           <w:bCs/>
         </w:rPr>
-        <w:t xml:space="preserve">5. </w:t>
+        <w:t xml:space="preserve">9. </w:t>
+      </w:r>
+      <w:r>
+        <w:t xml:space="preserve">Poulos, R. C., </w:t>
       </w:r>
       <w:r>
         <w:rPr>
@@ -1455,46 +1535,24 @@
         <w:t>Cai, Z.</w:t>
       </w:r>
       <w:r>
-        <w:t xml:space="preserve">, Apolinário, S., Baião, A. R., Pacini, C., Sousa, M. D., </w:t>
-      </w:r>
-      <w:proofErr w:type="spellStart"/>
-      <w:r>
-        <w:t>Vinga</w:t>
-      </w:r>
-      <w:proofErr w:type="spellEnd"/>
-      <w:r>
-        <w:t xml:space="preserve">, S., ... &amp; Gonçalves, E. (2024). </w:t>
+        <w:t xml:space="preserve">, Robinson, P. J., Reddel, R. R., &amp; Zhong, Q. (2022). </w:t>
       </w:r>
       <w:r>
         <w:rPr>
           <w:i/>
           <w:iCs/>
         </w:rPr>
-        <w:t>Synthetic augmentation of cancer cell line multi-omic datasets using unsupervised deep learning. Nature Communications</w:t>
-      </w:r>
-      <w:r>
-        <w:t>, 15(1), 1–12.</w:t>
-      </w:r>
-      <w:r>
-        <w:rPr>
-          <w:b/>
-          <w:bCs/>
-        </w:rPr>
-        <w:t xml:space="preserve"> FWCI: 2.</w:t>
-      </w:r>
-      <w:r>
-        <w:rPr>
-          <w:b/>
-          <w:bCs/>
-        </w:rPr>
-        <w:t>94</w:t>
-      </w:r>
-      <w:r>
-        <w:rPr>
-          <w:b/>
-          <w:bCs/>
-        </w:rPr>
-        <w:t>.</w:t>
+        <w:t>Opportunities for pharmacoproteomics in biomarker discovery. Proteomics</w:t>
+      </w:r>
+      <w:r>
+        <w:t>, 2200031.</w:t>
+      </w:r>
+      <w:r>
+        <w:rPr>
+          <w:b/>
+          <w:bCs/>
+        </w:rPr>
+        <w:t xml:space="preserve"> FWCI: 2.39.</w:t>
       </w:r>
       <w:r>
         <w:rPr>
@@ -1502,15 +1560,13 @@
           <w:sz w:val="19"/>
           <w:szCs w:val="19"/>
         </w:rPr>
-        <w:t xml:space="preserve"> [32 citations]</w:t>
+        <w:t xml:space="preserve"> [27 citations]</w:t>
       </w:r>
     </w:p>
     <w:p>
       <w:pPr>
         <w:spacing w:after="80"/>
         <w:ind w:left="540"/>
-      </w:pPr>
-      <w:r>
         <w:rPr>
           <w:i/>
           <w:iCs/>
@@ -1518,9 +1574,7 @@
           <w:sz w:val="19"/>
           <w:szCs w:val="19"/>
         </w:rPr>
-        <w:lastRenderedPageBreak/>
-        <w:t>First author. IF 1</w:t>
-      </w:r>
+      </w:pPr>
       <w:r>
         <w:rPr>
           <w:i/>
@@ -1529,8 +1583,73 @@
           <w:sz w:val="19"/>
           <w:szCs w:val="19"/>
         </w:rPr>
-        <w:t>5</w:t>
-      </w:r>
+        <w:t>Co-author. Invited Viewpoint article on pharmacoproteomics.</w:t>
+      </w:r>
+    </w:p>
+    <w:p>
+      <w:pPr>
+        <w:spacing w:before="120" w:after="40"/>
+        <w:ind w:left="360" w:hanging="360"/>
+      </w:pPr>
+      <w:r>
+        <w:rPr>
+          <w:b/>
+          <w:bCs/>
+        </w:rPr>
+        <w:t xml:space="preserve">10. </w:t>
+      </w:r>
+      <w:r>
+        <w:t xml:space="preserve">Guan, L., Tian, J., Cao, R., Li, M., </w:t>
+      </w:r>
+      <w:r>
+        <w:rPr>
+          <w:rStyle w:val="Strong"/>
+        </w:rPr>
+        <w:t>Cai, Z.</w:t>
+      </w:r>
+      <w:r>
+        <w:t xml:space="preserve">, &amp; Shen, W. (2014). </w:t>
+      </w:r>
+      <w:r>
+        <w:rPr>
+          <w:i/>
+          <w:iCs/>
+        </w:rPr>
+        <w:t>Barcode-like paper sensor for smartphone diagnostics: An application of blood typing.</w:t>
+      </w:r>
+      <w:r>
+        <w:t xml:space="preserve"> </w:t>
+      </w:r>
+      <w:r>
+        <w:rPr>
+          <w:rStyle w:val="Emphasis"/>
+        </w:rPr>
+        <w:t>Analytical Chemistry</w:t>
+      </w:r>
+      <w:r>
+        <w:t>, 2014, 86(22), 11362-11367.</w:t>
+      </w:r>
+      <w:r>
+        <w:rPr>
+          <w:b/>
+          <w:bCs/>
+        </w:rPr>
+        <w:t xml:space="preserve"> FWCI: 2.01. </w:t>
+      </w:r>
+      <w:r>
+        <w:rPr>
+          <w:color w:val="555555"/>
+          <w:sz w:val="19"/>
+          <w:szCs w:val="19"/>
+        </w:rPr>
+        <w:t>[131 citations]</w:t>
+      </w:r>
+    </w:p>
+    <w:p>
+      <w:pPr>
+        <w:spacing w:after="80"/>
+        <w:ind w:left="540"/>
+      </w:pPr>
       <w:r>
         <w:rPr>
           <w:i/>
@@ -1539,429 +1658,7 @@
           <w:sz w:val="19"/>
           <w:szCs w:val="19"/>
         </w:rPr>
-        <w:t>.7. Introduces MOSA (Multi-Omics Synthetic Augmentation), a generative AI approach using multi-view variational autoencoders. International collaboration with University of Lisbon.</w:t>
-      </w:r>
-    </w:p>
-    <w:p>
-      <w:pPr>
-        <w:spacing w:before="120" w:after="40"/>
-        <w:ind w:left="360" w:hanging="360"/>
-      </w:pPr>
-      <w:r>
-        <w:rPr>
-          <w:b/>
-          <w:bCs/>
-        </w:rPr>
-        <w:t xml:space="preserve">6. </w:t>
-      </w:r>
-      <w:r>
-        <w:rPr>
-          <w:b/>
-          <w:bCs/>
-          <w:u w:val="single"/>
-        </w:rPr>
-        <w:t>Cai, Z.</w:t>
-      </w:r>
-      <w:r>
-        <w:t xml:space="preserve">, Poulos, R. C., Aref, A., Robinson, P. J., Reddel, R. R., &amp; Zhong, Q. (2024). </w:t>
-      </w:r>
-      <w:r>
-        <w:rPr>
-          <w:i/>
-          <w:iCs/>
-        </w:rPr>
-        <w:t>DeePathNet: a transformer-based deep learning model integrating multi-omic data with cancer pathways. Cancer Research Communications</w:t>
-      </w:r>
-      <w:r>
-        <w:t>, 4(12), 3151–3164.</w:t>
-      </w:r>
-      <w:r>
-        <w:rPr>
-          <w:b/>
-          <w:bCs/>
-        </w:rPr>
-        <w:t xml:space="preserve"> FWCI: 3.</w:t>
-      </w:r>
-      <w:r>
-        <w:rPr>
-          <w:b/>
-          <w:bCs/>
-        </w:rPr>
-        <w:t>75</w:t>
-      </w:r>
-      <w:r>
-        <w:rPr>
-          <w:b/>
-          <w:bCs/>
-        </w:rPr>
-        <w:t>.</w:t>
-      </w:r>
-      <w:r>
-        <w:rPr>
-          <w:color w:val="555555"/>
-          <w:sz w:val="19"/>
-          <w:szCs w:val="19"/>
-        </w:rPr>
-        <w:t xml:space="preserve"> [33 citations]</w:t>
-      </w:r>
-    </w:p>
-    <w:p>
-      <w:pPr>
-        <w:spacing w:after="80"/>
-        <w:ind w:left="540"/>
-      </w:pPr>
-      <w:r>
-        <w:rPr>
-          <w:i/>
-          <w:iCs/>
-          <w:color w:val="8B0000"/>
-          <w:sz w:val="19"/>
-          <w:szCs w:val="19"/>
-        </w:rPr>
-        <w:t>First author. Novel transformer-based architecture integrating multi-omic data with cancer pathway knowledge for improved interpretability and prediction accuracy.</w:t>
-      </w:r>
-    </w:p>
-    <w:p>
-      <w:pPr>
-        <w:spacing w:before="120" w:after="40"/>
-        <w:ind w:left="360" w:hanging="360"/>
-      </w:pPr>
-      <w:r>
-        <w:rPr>
-          <w:b/>
-          <w:bCs/>
-        </w:rPr>
-        <w:t xml:space="preserve">7. </w:t>
-      </w:r>
-      <w:r>
-        <w:t xml:space="preserve">Gonçalves, E.*, Poulos, R. C.*, </w:t>
-      </w:r>
-      <w:r>
-        <w:rPr>
-          <w:b/>
-          <w:bCs/>
-          <w:u w:val="single"/>
-        </w:rPr>
-        <w:t>Cai, Z.*</w:t>
-      </w:r>
-      <w:r>
-        <w:t xml:space="preserve">, ..., Robinson, P., Zhong, Q., Garnett, M., Reddel, R. R. (* equal contribution) (2022). </w:t>
-      </w:r>
-      <w:r>
-        <w:rPr>
-          <w:i/>
-          <w:iCs/>
-        </w:rPr>
-        <w:t>Pan-cancer proteomic map of 949 human cell lines. Cancer Cell</w:t>
-      </w:r>
-      <w:r>
-        <w:t>, 40(8), 835–849.</w:t>
-      </w:r>
-      <w:r>
-        <w:rPr>
-          <w:b/>
-          <w:bCs/>
-        </w:rPr>
-        <w:t xml:space="preserve"> FWCI: 10.50.</w:t>
-      </w:r>
-      <w:r>
-        <w:rPr>
-          <w:color w:val="555555"/>
-          <w:sz w:val="19"/>
-          <w:szCs w:val="19"/>
-        </w:rPr>
-        <w:t xml:space="preserve"> [230 citations]</w:t>
-      </w:r>
-    </w:p>
-    <w:p>
-      <w:pPr>
-        <w:spacing w:after="80"/>
-        <w:ind w:left="540"/>
-      </w:pPr>
-      <w:r>
-        <w:rPr>
-          <w:i/>
-          <w:iCs/>
-          <w:color w:val="8B0000"/>
-          <w:sz w:val="19"/>
-          <w:szCs w:val="19"/>
-        </w:rPr>
-        <w:t xml:space="preserve">Co-first author. IF </w:t>
-      </w:r>
-      <w:r>
-        <w:rPr>
-          <w:i/>
-          <w:iCs/>
-          <w:color w:val="8B0000"/>
-          <w:sz w:val="19"/>
-          <w:szCs w:val="19"/>
-        </w:rPr>
-        <w:t>44.5</w:t>
-      </w:r>
-      <w:r>
-        <w:rPr>
-          <w:i/>
-          <w:iCs/>
-          <w:color w:val="8B0000"/>
-          <w:sz w:val="19"/>
-          <w:szCs w:val="19"/>
-        </w:rPr>
-        <w:t>. The world’s largest pan-cancer proteomic resource at time of publication. Collaboration with Wellcome Sanger Institute (Cambridge, UK). Featured on ABC Radio and institutional media.</w:t>
-      </w:r>
-    </w:p>
-    <w:p>
-      <w:pPr>
-        <w:spacing w:before="120" w:after="40"/>
-        <w:ind w:left="360" w:hanging="360"/>
-      </w:pPr>
-      <w:r>
-        <w:rPr>
-          <w:b/>
-          <w:bCs/>
-        </w:rPr>
-        <w:t xml:space="preserve">8. </w:t>
-      </w:r>
-      <w:r>
-        <w:rPr>
-          <w:b/>
-          <w:bCs/>
-          <w:u w:val="single"/>
-        </w:rPr>
-        <w:t>Cai, Z.</w:t>
-      </w:r>
-      <w:r>
-        <w:t xml:space="preserve">, Poulos, R. C., Liu, J., &amp; Zhong, Q. (2022). </w:t>
-      </w:r>
-      <w:r>
-        <w:rPr>
-          <w:i/>
-          <w:iCs/>
-        </w:rPr>
-        <w:t>Machine learning for multi-omics data integration in cancer. iScience</w:t>
-      </w:r>
-      <w:r>
-        <w:t>, 103798.</w:t>
-      </w:r>
-      <w:r>
-        <w:rPr>
-          <w:b/>
-          <w:bCs/>
-        </w:rPr>
-        <w:t xml:space="preserve"> FWCI: 5.73.</w:t>
-      </w:r>
-      <w:r>
-        <w:rPr>
-          <w:color w:val="555555"/>
-          <w:sz w:val="19"/>
-          <w:szCs w:val="19"/>
-        </w:rPr>
-        <w:t xml:space="preserve"> [288 citations]</w:t>
-      </w:r>
-    </w:p>
-    <w:p>
-      <w:pPr>
-        <w:spacing w:after="80"/>
-        <w:ind w:left="540"/>
-      </w:pPr>
-      <w:r>
-        <w:rPr>
-          <w:i/>
-          <w:iCs/>
-          <w:color w:val="8B0000"/>
-          <w:sz w:val="19"/>
-          <w:szCs w:val="19"/>
-        </w:rPr>
-        <w:t xml:space="preserve">First author. IF </w:t>
-      </w:r>
-      <w:r>
-        <w:rPr>
-          <w:i/>
-          <w:iCs/>
-          <w:color w:val="8B0000"/>
-          <w:sz w:val="19"/>
-          <w:szCs w:val="19"/>
-        </w:rPr>
-        <w:t>4.1</w:t>
-      </w:r>
-      <w:r>
-        <w:rPr>
-          <w:i/>
-          <w:iCs/>
-          <w:color w:val="8B0000"/>
-          <w:sz w:val="19"/>
-          <w:szCs w:val="19"/>
-        </w:rPr>
-        <w:t>. Widely cited review for researchers entering the field of computational multi-omics integration.</w:t>
-      </w:r>
-    </w:p>
-    <w:p>
-      <w:pPr>
-        <w:spacing w:before="120" w:after="40"/>
-        <w:ind w:left="360" w:hanging="360"/>
-      </w:pPr>
-      <w:r>
-        <w:rPr>
-          <w:b/>
-          <w:bCs/>
-        </w:rPr>
-        <w:t xml:space="preserve">9. </w:t>
-      </w:r>
-      <w:r>
-        <w:t xml:space="preserve">Poulos, R. C., </w:t>
-      </w:r>
-      <w:r>
-        <w:rPr>
-          <w:b/>
-          <w:bCs/>
-          <w:u w:val="single"/>
-        </w:rPr>
-        <w:t>Cai, Z.</w:t>
-      </w:r>
-      <w:r>
-        <w:t xml:space="preserve">, Robinson, P. J., Reddel, R. R., &amp; Zhong, Q. (2022). </w:t>
-      </w:r>
-      <w:r>
-        <w:rPr>
-          <w:i/>
-          <w:iCs/>
-        </w:rPr>
-        <w:t>Opportunities for pharmacoproteomics in biomarker discovery. Proteomics</w:t>
-      </w:r>
-      <w:r>
-        <w:t>, 2200031.</w:t>
-      </w:r>
-      <w:r>
-        <w:rPr>
-          <w:b/>
-          <w:bCs/>
-        </w:rPr>
-        <w:t xml:space="preserve"> FWCI: 2.39.</w:t>
-      </w:r>
-      <w:r>
-        <w:rPr>
-          <w:color w:val="555555"/>
-          <w:sz w:val="19"/>
-          <w:szCs w:val="19"/>
-        </w:rPr>
-        <w:t xml:space="preserve"> [27 citations]</w:t>
-      </w:r>
-    </w:p>
-    <w:p>
-      <w:pPr>
-        <w:spacing w:after="80"/>
-        <w:ind w:left="540"/>
-        <w:rPr>
-          <w:i/>
-          <w:iCs/>
-          <w:color w:val="8B0000"/>
-          <w:sz w:val="19"/>
-          <w:szCs w:val="19"/>
-        </w:rPr>
-      </w:pPr>
-      <w:r>
-        <w:rPr>
-          <w:i/>
-          <w:iCs/>
-          <w:color w:val="8B0000"/>
-          <w:sz w:val="19"/>
-          <w:szCs w:val="19"/>
-        </w:rPr>
-        <w:t>Co-author. Invited Viewpoint article on pharmacoproteomics.</w:t>
-      </w:r>
-    </w:p>
-    <w:p>
-      <w:pPr>
-        <w:spacing w:before="120" w:after="40"/>
-        <w:ind w:left="360" w:hanging="360"/>
-      </w:pPr>
-      <w:r>
-        <w:rPr>
-          <w:b/>
-          <w:bCs/>
-        </w:rPr>
-        <w:t xml:space="preserve">10. </w:t>
-      </w:r>
-      <w:r>
-        <w:t xml:space="preserve">Guan, L., Tian, J., Cao, R., Li, M., </w:t>
-      </w:r>
-      <w:r>
-        <w:rPr>
-          <w:rStyle w:val="Strong"/>
-        </w:rPr>
-        <w:t>Cai, Z.</w:t>
-      </w:r>
-      <w:r>
-        <w:t xml:space="preserve">, &amp; Shen, W. (2014). </w:t>
-      </w:r>
-      <w:r>
-        <w:rPr>
-          <w:i/>
-          <w:iCs/>
-        </w:rPr>
-        <w:t>Barcode-like paper sensor for smartphone diagnostics: An application of blood typing.</w:t>
-      </w:r>
-      <w:r>
-        <w:t xml:space="preserve"> </w:t>
-      </w:r>
-      <w:r>
-        <w:rPr>
-          <w:rStyle w:val="Emphasis"/>
-        </w:rPr>
-        <w:t>Analytical Chemistry</w:t>
-      </w:r>
-      <w:r>
-        <w:t>, 2014, 86(22), 11362-11367.</w:t>
-      </w:r>
-      <w:r>
-        <w:rPr>
-          <w:b/>
-          <w:bCs/>
-        </w:rPr>
-        <w:t xml:space="preserve"> FWCI: 2.01. </w:t>
-      </w:r>
-      <w:r>
-        <w:rPr>
-          <w:color w:val="555555"/>
-          <w:sz w:val="19"/>
-          <w:szCs w:val="19"/>
-        </w:rPr>
-        <w:t>[131 citations]</w:t>
-      </w:r>
-    </w:p>
-    <w:p>
-      <w:pPr>
-        <w:spacing w:after="80"/>
-        <w:ind w:left="540"/>
-      </w:pPr>
-      <w:r>
-        <w:rPr>
-          <w:i/>
-          <w:iCs/>
-          <w:color w:val="8B0000"/>
-          <w:sz w:val="19"/>
-          <w:szCs w:val="19"/>
-        </w:rPr>
-        <w:t xml:space="preserve">Co-author. IF 6.7. </w:t>
-      </w:r>
-      <w:r>
-        <w:rPr>
-          <w:i/>
-          <w:iCs/>
-          <w:color w:val="8B0000"/>
-          <w:sz w:val="19"/>
-          <w:szCs w:val="19"/>
-        </w:rPr>
-        <w:t>Interdisciplinary study integrating paper-based microfluidic diagnostics with smartphone technology for point-of-care blood typing</w:t>
-      </w:r>
-      <w:r>
-        <w:rPr>
-          <w:i/>
-          <w:iCs/>
-          <w:color w:val="8B0000"/>
-          <w:sz w:val="19"/>
-          <w:szCs w:val="19"/>
-        </w:rPr>
-        <w:t>.</w:t>
+        <w:t>Co-author. IF 6.7. Interdisciplinary study integrating paper-based microfluidic diagnostics with smartphone technology for point-of-care blood typing.</w:t>
       </w:r>
     </w:p>
     <w:p>
@@ -2103,6 +1800,7 @@
         <w:pStyle w:val="Heading2"/>
       </w:pPr>
       <w:r>
+        <w:lastRenderedPageBreak/>
         <w:t>Mentorship of Researchers</w:t>
       </w:r>
     </w:p>
@@ -2115,7 +1813,6 @@
           <w:b/>
           <w:bCs/>
         </w:rPr>
-        <w:lastRenderedPageBreak/>
         <w:t>Dr Emma Boys</w:t>
       </w:r>
       <w:r>
@@ -2222,6 +1919,21 @@
         <w:spacing w:before="80" w:after="40"/>
       </w:pPr>
       <w:r>
+        <w:t xml:space="preserve">Cancer Bioinformatics Australia Symposium, Brisbane (2026): </w:t>
+      </w:r>
+      <w:r>
+        <w:rPr>
+          <w:i/>
+          <w:iCs/>
+        </w:rPr>
+        <w:t>Augmenting the Childhood Cancer Cell Map through Multi-Omic Data Synthesis and Predictive Modelling</w:t>
+      </w:r>
+    </w:p>
+    <w:p>
+      <w:pPr>
+        <w:spacing w:after="40"/>
+      </w:pPr>
+      <w:r>
         <w:t>Advancing Multi-Omics into the Clinic Symposium (2024)</w:t>
       </w:r>
     </w:p>
@@ -2346,6 +2058,7 @@
         <w:pStyle w:val="Heading2"/>
       </w:pPr>
       <w:r>
+        <w:lastRenderedPageBreak/>
         <w:t>Internal Service</w:t>
       </w:r>
     </w:p>
@@ -2369,7 +2082,6 @@
         <w:spacing w:after="80"/>
       </w:pPr>
       <w:r>
-        <w:lastRenderedPageBreak/>
         <w:t>Managed and hosted this monthly forum, bringing together 10–15 researchers from across the ProCan research initiative (Cancer Data Science, Software Engineering, and Oncology teams). Facilitates cross-team discussion, knowledge exchange, and critical evaluation of recent publications in cancer data science and machine learning.</w:t>
       </w:r>
     </w:p>
@@ -2409,15 +2121,7 @@
         <w:spacing w:before="80" w:after="80"/>
       </w:pPr>
       <w:r>
-        <w:t xml:space="preserve">Reviewed approximately five manuscripts per year since 2023, totalling over ten reviews. Journals </w:t>
-      </w:r>
-      <w:proofErr w:type="gramStart"/>
-      <w:r>
-        <w:t>include:</w:t>
-      </w:r>
-      <w:proofErr w:type="gramEnd"/>
-      <w:r>
-        <w:t xml:space="preserve"> </w:t>
+        <w:t xml:space="preserve">Reviewed approximately five manuscripts per year since 2023, totalling over ten reviews. Journals include: </w:t>
       </w:r>
       <w:r>
         <w:rPr>
@@ -2591,15 +2295,7 @@
         <w:t xml:space="preserve">Programming and Software Engineering: </w:t>
       </w:r>
       <w:r>
-        <w:t xml:space="preserve">Python, R, </w:t>
-      </w:r>
-      <w:proofErr w:type="spellStart"/>
-      <w:r>
-        <w:t>PyTorch</w:t>
-      </w:r>
-      <w:proofErr w:type="spellEnd"/>
-      <w:r>
-        <w:t>, SQL, C++, Linux, Perl, and bioinformatics software suites.</w:t>
+        <w:t>Python, R, PyTorch, SQL, C++, Linux, Perl, and bioinformatics software suites.</w:t>
       </w:r>
     </w:p>
     <w:p>
@@ -2619,33 +2315,8 @@
     </w:p>
     <w:p>
       <w:pPr>
-        <w:pStyle w:val="Heading1"/>
-      </w:pPr>
-      <w:r>
-        <w:t>Referees</w:t>
-      </w:r>
-    </w:p>
-    <w:p>
-      <w:pPr>
-        <w:pBdr>
-          <w:bottom w:val="single" w:sz="6" w:space="0" w:color="1F4E79"/>
-        </w:pBdr>
-        <w:spacing w:before="60"/>
-      </w:pPr>
-    </w:p>
-    <w:p>
-      <w:pPr>
         <w:spacing w:before="80"/>
       </w:pPr>
-      <w:r>
-        <w:rPr>
-          <w:i/>
-          <w:iCs/>
-          <w:color w:val="555555"/>
-        </w:rPr>
-        <w:lastRenderedPageBreak/>
-        <w:t>Available upon request.</w:t>
-      </w:r>
     </w:p>
     <w:sectPr>
       <w:headerReference w:type="default" r:id="rId8"/>

</xml_diff>